<commit_message>
Artigo A1: discussão reforçada com evidência atual, objetivos e conclusões melhorados
- Referências recentes verificadas (PubMed) adicionadas e citadas na Discussão:
  Duignan et al. (2020, revisão sistemática autorrelato×carga), Yuan et al.
  (2023, fadiga mental em esportes coletivos) e Grgic et al. (2022, meta-análise
  fadiga mental). referencias.json 78→81.
- Discussão: parágrafos de desacoplamento (Duignan + TOST como equivalência a
  zero) e de marcadores (relevância da fadiga mental) aprofundados.
- Objetivos: objetivo geral mais preciso; +2 objetivos específicos (k RCI/MDC,
  l TOST) e +1 hipótese (H6, equivalência do desacoplamento).
- Conclusões: reescritas em 5 conclusões ligadas às hipóteses (H1–H6) +
  Recomendação aplicada.

Co-Authored-By: Claude Opus 4.8 <noreply@anthropic.com>
Claude-Session: https://claude.ai/code/session_0157sZ1CmW4MRSmx6a9GoYrN
</commit_message>
<xml_diff>
--- a/auditoria_brums_hiit/tese/Artigo_BRUMS_HIIT_A1.docx
+++ b/auditoria_brums_hiit/tese/Artigo_BRUMS_HIIT_A1.docx
@@ -388,7 +388,7 @@
         <w:t xml:space="preserve">Objetivo geral. </w:t>
       </w:r>
       <w:r>
-        <w:t xml:space="preserve">Caracterizar a resposta do perfil de humor ao longo de um microciclo com HIIT e a confiabilidade dessa medida, e identificar os marcadores mais úteis para o monitoramento da fadiga.</w:t>
+        <w:t xml:space="preserve">Caracterizar, respeitando a estrutura de medidas repetidas, como e em que magnitude o perfil de humor de atletas de handebol de elite responde a um microciclo com HIIT; determinar se essa resposta é uma mudança de estado confiável (e não artefato de medida nem ausência real de efeito por piso); e identificar os marcadores mais sensíveis e confiáveis para o monitoramento aplicado da fadiga.</w:t>
       </w:r>
     </w:p>
     <w:p>
@@ -404,7 +404,7 @@
         <w:t xml:space="preserve">Objetivos específicos. </w:t>
       </w:r>
       <w:r>
-        <w:t xml:space="preserve">(a) descrever as distribuições, o efeito piso e a normalidade das variáveis; (b) quantificar a resposta aguda pré→pós por subescala (tamanho de efeito) e confirmá-la por permutação restrita; (c) modelar o acúmulo semanal com inclinações aleatórias por atleta e isolar o efeito dos dias de HIIT; (d) confirmar o achado no plano multivariado (Hotelling T², MANOVA, PERMANOVA) e bayesiano; (e) avaliar a qualidade da medida — confiabilidade (α, ω), AFC, AFE, TRI, validade discriminante (HTMT) — e a invariância pré→pós (configural→estrita/parcial); (f) mapear as correlações intra-sujeito (rm_corr) e a convergência com autorrelatos externos; (g) mensurar a capacidade diagnóstica (ROC de níveis e de derivadas) e a validação preditiva fora da amostra (leave-one-athlete-out); (h) caracterizar a velocidade de mudança (derivadas por variável e por atleta) e formalizá-la em cálculo (limites e derivadas); (i) segmentar os atletas por padrão de resposta e decompor a variância em traço vs. estado; (j) testar o acoplamento carga interna × humor e ranquear os preditores de estado de fadiga por sensibilidade e confiabilidade.</w:t>
+        <w:t xml:space="preserve">(a) descrever distribuições, efeito piso e normalidade das variáveis; (b) quantificar a resposta aguda pré→pós por subescala (tamanho de efeito) e confirmá-la por permutação restrita; (c) modelar o acúmulo semanal com inclinações aleatórias por atleta e isolar o efeito dos dias de HIIT; (d) confirmar o achado no plano multivariado (Hotelling T², MANOVA, PERMANOVA) e bayesiano; (e) avaliar a qualidade da medida (confiabilidade α/ω, AFC, AFE, TRI, HTMT) e a invariância pré→pós (configural→estrita/parcial); (f) mapear as correlações intra-sujeito (rm_corr) e a convergência com autorrelatos externos; (g) mensurar a capacidade diagnóstica (ROC de níveis e derivadas) e a validação preditiva fora da amostra (leave-one-athlete-out); (h) caracterizar a velocidade de mudança e formalizá-la em cálculo (limites e derivadas); (i) segmentar os atletas por padrão de resposta e decompor a variância em traço vs. estado; (j) testar o acoplamento carga interna × humor e ranquear os preditores de fadiga por sensibilidade e confiabilidade; (k) quantificar, por atleta, a mudança confiável (RCI/MDC) — distinguindo resposta real de ruído de medida; e (l) submeter os achados nulos a testes de equivalência (TOST), estabelecendo equivalência formal quando cabível.</w:t>
       </w:r>
     </w:p>
     <w:p>
@@ -413,7 +413,7 @@
         <w:jc w:val="both"/>
       </w:pPr>
       <w:r>
-        <w:t xml:space="preserve">Hipóteses: (H1) o humor deteriora ao longo da semana, no eixo energia–fadiga; (H2) os dias de HIIT associam-se a mais fadiga, menos vigor e maior perturbação; (H3) as subescalas negativas têm efeito piso e baixa sensibilidade; (H4) a maior parte da variância é traço, tornando frágil a decisão isolada; (H5) o BRUMS é válido e invariante no eixo energia–fadiga, e a fragilidade das negativas é piso, não ausência.</w:t>
+        <w:t xml:space="preserve">Hipóteses: (H1) o humor deteriora ao longo da semana, no eixo energia–fadiga; (H2) os dias de HIIT associam-se a mais fadiga, menos vigor e maior perturbação; (H3) as subescalas negativas têm efeito piso e baixa sensibilidade — a "ausência de resposta" é, em parte, incapacidade de medir; (H4) a maior parte da variância é traço, e apenas uma minoria de atletas exibe mudança confiável (RCI), tornando frágil a decisão pela média do grupo; (H5) o BRUMS é válido e invariante no eixo energia–fadiga (mudança de estado, não do instrumento); (H6) a carga interna objetiva é estatisticamente equivalente a zero como preditora da resposta aguda de humor (desacoplamento).</w:t>
       </w:r>
     </w:p>
     <w:p>
@@ -28914,7 +28914,7 @@
         <w:t xml:space="preserve">Carga alta não é humor pior. </w:t>
       </w:r>
       <w:r>
-        <w:t xml:space="preserve">O custo cardiovascular quase-máximo não prediz a perturbação aguda do humor (desacoplamento robusto à FDR; TRIMP×ΔPTH r = -0,32). Num regime de teto, a variação relevante do humor depende de tolerância e recuperação individuais, não da carga objetiva — o que fundamenta a superioridade das medidas subjetivas no monitoramento da resposta ao treino (Saw, Main &amp; Gastin, 2016) e a validade da PSE como marcador de estímulo, não de resposta (Haddad et al., 2017).</w:t>
+        <w:t xml:space="preserve">O custo cardiovascular quase-máximo não prediz a perturbação aguda do humor (desacoplamento robusto à FDR; TRIMP×ΔPTH r = -0,32). Num regime de teto, a variação relevante do humor depende de tolerância e recuperação individuais, não da carga objetiva — o que fundamenta a superioridade das medidas subjetivas no monitoramento da resposta ao treino (Saw, Main &amp; Gastin, 2016) e a validade da PSE como marcador de estímulo, não de resposta (Haddad et al., 2017). Esse desacoplamento está longe de ser um artefato local: uma revisão sistemática recente de autorrelatos de um único item em esportes coletivos encontrou associações com a carga de treino que variam de nulas a, no máximo, moderadas — predominantemente triviais a moderadas nos estudos com mais observações —, questionando a própria expectativa de que medidas subjetivas devam espelhar a carga objetiva (Duignan et al., 2020). Nossos testes de equivalência (TOST) formalizam esse ponto: para os índices centrais, a associação carga↔humor e o contraste HIIT-vs-sem são estatisticamente equivalentes a zero, não apenas "não significativos".</w:t>
       </w:r>
     </w:p>
     <w:p>
@@ -28978,7 +28978,7 @@
         <w:t xml:space="preserve">Marcadores para o monitoramento. </w:t>
       </w:r>
       <w:r>
-        <w:t xml:space="preserve">A fadiga física é o marcador mais sensível de estado de fadiga (AUC 0,90); sua baixa estabilidade é a assinatura desejável de um sinal de estado. A fadiga mental e a depressão combinam sensibilidade e confiabilidade, servindo ao acompanhamento dia a dia; a tensão, embora estável, é diagnosticamente cega. A validade convergente intra-sujeito entre o BRUMS e os autorrelatos externos reforça a interpretação. No contexto do handebol — modalidade de alta demanda intermitente e calendário denso —, isso sustenta um protocolo de monitoramento parcimonioso e de baixo custo, aplicável no dia a dia do clube.</w:t>
+        <w:t xml:space="preserve">A fadiga física é o marcador mais sensível de estado de fadiga (AUC 0,90); sua baixa estabilidade é a assinatura desejável de um sinal de estado. A fadiga mental e a depressão combinam sensibilidade e confiabilidade, servindo ao acompanhamento dia a dia; a tensão, embora estável, é diagnosticamente cega. A validade convergente intra-sujeito entre o BRUMS e os autorrelatos externos reforça a interpretação. A ênfase na fadiga — física e mental — não é arbitrária: revisões e meta-análises recentes mostram que a fadiga mental prejudica de forma consistente o desempenho técnico e físico em esportes coletivos (passe, chute, corrida intermitente), com efeitos pequenos a moderados (Yuan et al., 2023; Grgic, Mikulic &amp; Mikulic, 2022) — de modo que um marcador sensível e confiável desse estado tem valor prático direto. No contexto do handebol — modalidade de alta demanda intermitente e calendário denso —, isso sustenta um protocolo de monitoramento parcimonioso e de baixo custo, aplicável no dia a dia do clube.</w:t>
       </w:r>
     </w:p>
     <w:p>
@@ -29044,7 +29044,7 @@
         <w:jc w:val="both"/>
       </w:pPr>
       <w:r>
-        <w:t xml:space="preserve">Em atletas de handebol de elite submetidos a um microciclo com HIIT, a evidência convergente de todas as camadas analíticas sustenta cinco conclusões:</w:t>
+        <w:t xml:space="preserve">Em atletas de handebol de elite submetidos a um microciclo com HIIT, a evidência convergente das camadas analíticas — cada hipótese testada e sustentada — permite cinco conclusões e uma recomendação aplicada:</w:t>
       </w:r>
     </w:p>
     <w:p>
@@ -29057,10 +29057,10 @@
           <w:b/>
           <w:bCs/>
         </w:rPr>
-        <w:t xml:space="preserve">(1) </w:t>
+        <w:t xml:space="preserve">(1) Resposta específica no eixo energia–fadiga (H1, H2). </w:t>
       </w:r>
       <w:r>
-        <w:t xml:space="preserve">A resposta de humor é real e mora no eixo energia–fadiga: o vigor recua e a fadiga (sobretudo física) se eleva, com as dimensões negativas quase inertes por efeito piso — que é limitação de medida, não ausência de fenômeno.</w:t>
+        <w:t xml:space="preserve">O microciclo eleva a fadiga (sobretudo física, dz ≈ 1,0) e reduz o vigor, sem inflar as dimensões negativas; a inércia destas é efeito piso — limitação de medida, não ausência de fenômeno (H3).</w:t>
       </w:r>
     </w:p>
     <w:p>
@@ -29073,10 +29073,10 @@
           <w:b/>
           <w:bCs/>
         </w:rPr>
-        <w:t xml:space="preserve">(2) </w:t>
+        <w:t xml:space="preserve">(2) Mudança de estado, não de medida (H5). </w:t>
       </w:r>
       <w:r>
-        <w:t xml:space="preserve">A mudança é de estado, não de medida: a escala é confiável e invariante pré→pós (métrica sustentada; escalar aproximada; estrita no limite, com quebra local no item "Sonolento").</w:t>
+        <w:t xml:space="preserve">A escala é confiável e invariante pré→pós (métrica sustentada, ΔCFI −0,004; escalar aproximada; estrita no limite), com a única quebra localizada e identificada no item "Sonolento" — a leitura de estado é, portanto, legítima.</w:t>
       </w:r>
     </w:p>
     <w:p>
@@ -29089,10 +29089,10 @@
           <w:b/>
           <w:bCs/>
         </w:rPr>
-        <w:t xml:space="preserve">(3) </w:t>
+        <w:t xml:space="preserve">(3) Resposta fortemente individual (H4). </w:t>
       </w:r>
       <w:r>
-        <w:t xml:space="preserve">A resposta é fortemente individual (variância majoritariamente de traço; segmentação em resilientes, perturbados e um extremo), exigindo monitoramento por tendência individual e não pela média do grupo.</w:t>
+        <w:t xml:space="preserve">A maior parte da variância é traço e apenas uma minoria de atletas atinge mudança confiável (RCI acima da MDC); a média do grupo esconde trajetórias opostas, exigindo monitoramento por tendência individual.</w:t>
       </w:r>
     </w:p>
     <w:p>
@@ -29105,10 +29105,10 @@
           <w:b/>
           <w:bCs/>
         </w:rPr>
-        <w:t xml:space="preserve">(4) </w:t>
+        <w:t xml:space="preserve">(4) Desacoplamento carga↔humor, agora formal (H6). </w:t>
       </w:r>
       <w:r>
-        <w:t xml:space="preserve">A carga interna não determina a resposta de humor (desacoplamento robusto): FC/TRIMP não substituem o autorrelato.</w:t>
+        <w:t xml:space="preserve">A carga interna não determina a resposta aguda de humor: os testes de equivalência (TOST) mostram equivalência estatística a zero para os índices centrais — FC/TRIMP não substituem o autorrelato, convergindo com a literatura de monitoramento (Saw et al., 2016; Duignan et al., 2020).</w:t>
       </w:r>
     </w:p>
     <w:p>
@@ -29121,10 +29121,26 @@
           <w:b/>
           <w:bCs/>
         </w:rPr>
-        <w:t xml:space="preserve">(5) </w:t>
+        <w:t xml:space="preserve">(5) Marcadores ótimos de monitoramento. </w:t>
       </w:r>
       <w:r>
-        <w:t xml:space="preserve">O monitoramento eficiente combina a fadiga física (sensibilidade) e a fadiga mental/depressão (confiabilidade), num protocolo parcimonioso e reprodutível. A convergência de métodos independentes para a mesma conclusão é a melhor evidência de que ela descreve o fenômeno, e não o método.</w:t>
+        <w:t xml:space="preserve">A fadiga física é o marcador mais sensível de estado; a fadiga mental e a depressão somam sensibilidade e confiabilidade — relevantes porque a fadiga mental compromete o desempenho em esportes coletivos (Yuan et al., 2023; Grgic et al., 2022).</w:t>
+      </w:r>
+    </w:p>
+    <w:p>
+      <w:pPr>
+        <w:spacing w:after="140" w:before="0" w:line="300"/>
+        <w:jc w:val="both"/>
+      </w:pPr>
+      <w:r>
+        <w:rPr>
+          <w:b/>
+          <w:bCs/>
+        </w:rPr>
+        <w:t xml:space="preserve">Recomendação aplicada. </w:t>
+      </w:r>
+      <w:r>
+        <w:t xml:space="preserve">Monitorar o humor por tendência individual, priorizando a fadiga física (sentinela sensível) somada à fadiga mental/depressão (âncoras confiáveis), num protocolo parcimonioso e reprodutível; interpretar variações abaixo da mínima mudança detectável como ruído e não substituir o autorrelato por marcadores de carga. A convergência de métodos independentes para a mesma conclusão é a melhor evidência de que ela descreve o fenômeno, e não o método.</w:t>
       </w:r>
     </w:p>
     <w:p>
@@ -29425,6 +29441,19 @@
           <w:szCs w:val="19"/>
         </w:rPr>
         <w:t xml:space="preserve">FLORA, D. B. Your coefficient alpha is probably wrong, but which coefficient omega is right? A tutorial on using R to obtain better reliability estimates. Advances in Methods and Practices in Psychological Science, v. 3, n. 4, p. 484-501, 2020. DOI: https://doi.org/10.1177/2515245920951747.</w:t>
+      </w:r>
+    </w:p>
+    <w:p>
+      <w:pPr>
+        <w:spacing w:after="100" w:line="260"/>
+        <w:jc w:val="both"/>
+      </w:pPr>
+      <w:r>
+        <w:rPr>
+          <w:sz w:val="19"/>
+          <w:szCs w:val="19"/>
+        </w:rPr>
+        <w:t xml:space="preserve">GRGIC, J.; MIKULIC, I.; MIKULIC, P. Negative effects of mental fatigue on performance in the Yo-Yo test, Loughborough soccer passing and shooting tests: a meta-analysis. Journal of Functional Morphology and Kinesiology, v. 7, n. 1, p. 10, 2022. DOI: https://doi.org/10.3390/jfmk7010010.</w:t>
       </w:r>
     </w:p>
     <w:p>
@@ -30165,6 +30194,19 @@
           <w:sz w:val="19"/>
           <w:szCs w:val="19"/>
         </w:rPr>
+        <w:t xml:space="preserve">YUAN, R. et al. The effects of mental fatigue on sport-specific motor performance among team sport athletes: a systematic scoping review. Frontiers in Psychology, v. 14, p. 1143618, 2023. DOI: https://doi.org/10.3389/fpsyg.2023.1143618.</w:t>
+      </w:r>
+    </w:p>
+    <w:p>
+      <w:pPr>
+        <w:spacing w:after="100" w:line="260"/>
+        <w:jc w:val="both"/>
+      </w:pPr>
+      <w:r>
+        <w:rPr>
+          <w:sz w:val="19"/>
+          <w:szCs w:val="19"/>
+        </w:rPr>
         <w:t xml:space="preserve">ZHANG, C.-Q. et al. Psychometric properties of the Brunel Mood Scale in Chinese adolescents and adults. Journal of Sports Sciences, v. 32, n. 15, p. 1465-1476, 2014. DOI: https://doi.org/10.1080/02640414.2014.898184.</w:t>
       </w:r>
     </w:p>

</xml_diff>